<commit_message>
improve prompt quality more humanlike
</commit_message>
<xml_diff>
--- a/docs/v2_PLP-Group 2_Final Report_IntelligentCandidateScreening.docx
+++ b/docs/v2_PLP-Group 2_Final Report_IntelligentCandidateScreening.docx
@@ -2480,13 +2480,13 @@
     <w:tbl>
       <w:tblPr>
         <w:tblStyle w:val="TableGrid"/>
-        <w:tblW w:w="0" w:type="auto"/>
+        <w:tblW w:w="9359" w:type="dxa"/>
         <w:tblLayout w:type="fixed"/>
         <w:tblLook w:val="0420" w:firstRow="1" w:lastRow="0" w:firstColumn="0" w:lastColumn="0" w:noHBand="0" w:noVBand="1"/>
       </w:tblPr>
       <w:tblGrid>
-        <w:gridCol w:w="2940"/>
-        <w:gridCol w:w="3922"/>
+        <w:gridCol w:w="2785"/>
+        <w:gridCol w:w="4077"/>
         <w:gridCol w:w="2497"/>
       </w:tblGrid>
       <w:tr>
@@ -2495,7 +2495,7 @@
         </w:trPr>
         <w:tc>
           <w:tcPr>
-            <w:tcW w:w="2940" w:type="dxa"/>
+            <w:tcW w:w="2785" w:type="dxa"/>
             <w:shd w:val="clear" w:color="auto" w:fill="F2F2F2"/>
           </w:tcPr>
           <w:p>
@@ -2506,7 +2506,7 @@
         </w:tc>
         <w:tc>
           <w:tcPr>
-            <w:tcW w:w="3922" w:type="dxa"/>
+            <w:tcW w:w="4077" w:type="dxa"/>
             <w:shd w:val="clear" w:color="auto" w:fill="F2F2F2"/>
           </w:tcPr>
           <w:p>
@@ -2530,7 +2530,7 @@
       <w:tr>
         <w:tc>
           <w:tcPr>
-            <w:tcW w:w="2940" w:type="dxa"/>
+            <w:tcW w:w="2785" w:type="dxa"/>
           </w:tcPr>
           <w:p>
             <w:proofErr w:type="spellStart"/>
@@ -2545,7 +2545,7 @@
         </w:tc>
         <w:tc>
           <w:tcPr>
-            <w:tcW w:w="3922" w:type="dxa"/>
+            <w:tcW w:w="4077" w:type="dxa"/>
           </w:tcPr>
           <w:p>
             <w:r>
@@ -2572,7 +2572,7 @@
       <w:tr>
         <w:tc>
           <w:tcPr>
-            <w:tcW w:w="2940" w:type="dxa"/>
+            <w:tcW w:w="2785" w:type="dxa"/>
           </w:tcPr>
           <w:p>
             <w:r>
@@ -2582,7 +2582,7 @@
         </w:tc>
         <w:tc>
           <w:tcPr>
-            <w:tcW w:w="3922" w:type="dxa"/>
+            <w:tcW w:w="4077" w:type="dxa"/>
           </w:tcPr>
           <w:p>
             <w:r>
@@ -2604,7 +2604,7 @@
       <w:tr>
         <w:tc>
           <w:tcPr>
-            <w:tcW w:w="2940" w:type="dxa"/>
+            <w:tcW w:w="2785" w:type="dxa"/>
           </w:tcPr>
           <w:p>
             <w:proofErr w:type="spellStart"/>
@@ -2619,7 +2619,7 @@
         </w:tc>
         <w:tc>
           <w:tcPr>
-            <w:tcW w:w="3922" w:type="dxa"/>
+            <w:tcW w:w="4077" w:type="dxa"/>
           </w:tcPr>
           <w:p>
             <w:r>
@@ -2641,7 +2641,7 @@
       <w:tr>
         <w:tc>
           <w:tcPr>
-            <w:tcW w:w="2940" w:type="dxa"/>
+            <w:tcW w:w="2785" w:type="dxa"/>
           </w:tcPr>
           <w:p>
             <w:r>
@@ -2651,7 +2651,7 @@
         </w:tc>
         <w:tc>
           <w:tcPr>
-            <w:tcW w:w="3922" w:type="dxa"/>
+            <w:tcW w:w="4077" w:type="dxa"/>
           </w:tcPr>
           <w:p>
             <w:r>
@@ -2673,7 +2673,7 @@
       <w:tr>
         <w:tc>
           <w:tcPr>
-            <w:tcW w:w="2940" w:type="dxa"/>
+            <w:tcW w:w="2785" w:type="dxa"/>
           </w:tcPr>
           <w:p>
             <w:r>
@@ -2684,7 +2684,7 @@
         </w:tc>
         <w:tc>
           <w:tcPr>
-            <w:tcW w:w="3922" w:type="dxa"/>
+            <w:tcW w:w="4077" w:type="dxa"/>
           </w:tcPr>
           <w:p>
             <w:r>
@@ -2706,21 +2706,21 @@
       <w:tr>
         <w:tc>
           <w:tcPr>
-            <w:tcW w:w="2940" w:type="dxa"/>
-          </w:tcPr>
-          <w:p>
-            <w:r>
-              <w:t>Qwen</w:t>
-            </w:r>
-          </w:p>
-        </w:tc>
-        <w:tc>
-          <w:tcPr>
-            <w:tcW w:w="3922" w:type="dxa"/>
-          </w:tcPr>
-          <w:p>
-            <w:r>
-              <w:t>Chat answers in later chat versions</w:t>
+            <w:tcW w:w="2785" w:type="dxa"/>
+          </w:tcPr>
+          <w:p>
+            <w:r>
+              <w:t>Qwen3.5-4B</w:t>
+            </w:r>
+          </w:p>
+        </w:tc>
+        <w:tc>
+          <w:tcPr>
+            <w:tcW w:w="4077" w:type="dxa"/>
+          </w:tcPr>
+          <w:p>
+            <w:r>
+              <w:t>Reasoning QA model</w:t>
             </w:r>
           </w:p>
         </w:tc>
@@ -3938,6 +3938,7 @@
     </w:p>
     <w:p>
       <w:r>
+        <w:lastRenderedPageBreak/>
         <w:drawing>
           <wp:inline distT="0" distB="0" distL="0" distR="0" wp14:anchorId="2A6F44E5" wp14:editId="54BB5234">
             <wp:extent cx="5943600" cy="1323975"/>
@@ -3974,6 +3975,80 @@
           </wp:inline>
         </w:drawing>
       </w:r>
+      <w:r>
+        <w:drawing>
+          <wp:inline distT="0" distB="0" distL="0" distR="0" wp14:anchorId="6FB385A3" wp14:editId="223BE82A">
+            <wp:extent cx="5943600" cy="2373630"/>
+            <wp:effectExtent l="0" t="0" r="0" b="1270"/>
+            <wp:docPr id="1087869264" name="Picture 1"/>
+            <wp:cNvGraphicFramePr>
+              <a:graphicFrameLocks xmlns:a="http://schemas.openxmlformats.org/drawingml/2006/main" noChangeAspect="1"/>
+            </wp:cNvGraphicFramePr>
+            <a:graphic xmlns:a="http://schemas.openxmlformats.org/drawingml/2006/main">
+              <a:graphicData uri="http://schemas.openxmlformats.org/drawingml/2006/picture">
+                <pic:pic xmlns:pic="http://schemas.openxmlformats.org/drawingml/2006/picture">
+                  <pic:nvPicPr>
+                    <pic:cNvPr id="1087869264" name=""/>
+                    <pic:cNvPicPr/>
+                  </pic:nvPicPr>
+                  <pic:blipFill>
+                    <a:blip r:embed="rId7"/>
+                    <a:stretch>
+                      <a:fillRect/>
+                    </a:stretch>
+                  </pic:blipFill>
+                  <pic:spPr>
+                    <a:xfrm>
+                      <a:off x="0" y="0"/>
+                      <a:ext cx="5943600" cy="2373630"/>
+                    </a:xfrm>
+                    <a:prstGeom prst="rect">
+                      <a:avLst/>
+                    </a:prstGeom>
+                  </pic:spPr>
+                </pic:pic>
+              </a:graphicData>
+            </a:graphic>
+          </wp:inline>
+        </w:drawing>
+      </w:r>
+      <w:r>
+        <w:drawing>
+          <wp:inline distT="0" distB="0" distL="0" distR="0" wp14:anchorId="51D97338" wp14:editId="6428F7B9">
+            <wp:extent cx="5943600" cy="2580640"/>
+            <wp:effectExtent l="0" t="0" r="0" b="0"/>
+            <wp:docPr id="1006731778" name="Picture 1"/>
+            <wp:cNvGraphicFramePr>
+              <a:graphicFrameLocks xmlns:a="http://schemas.openxmlformats.org/drawingml/2006/main" noChangeAspect="1"/>
+            </wp:cNvGraphicFramePr>
+            <a:graphic xmlns:a="http://schemas.openxmlformats.org/drawingml/2006/main">
+              <a:graphicData uri="http://schemas.openxmlformats.org/drawingml/2006/picture">
+                <pic:pic xmlns:pic="http://schemas.openxmlformats.org/drawingml/2006/picture">
+                  <pic:nvPicPr>
+                    <pic:cNvPr id="1006731778" name=""/>
+                    <pic:cNvPicPr/>
+                  </pic:nvPicPr>
+                  <pic:blipFill>
+                    <a:blip r:embed="rId8"/>
+                    <a:stretch>
+                      <a:fillRect/>
+                    </a:stretch>
+                  </pic:blipFill>
+                  <pic:spPr>
+                    <a:xfrm>
+                      <a:off x="0" y="0"/>
+                      <a:ext cx="5943600" cy="2580640"/>
+                    </a:xfrm>
+                    <a:prstGeom prst="rect">
+                      <a:avLst/>
+                    </a:prstGeom>
+                  </pic:spPr>
+                </pic:pic>
+              </a:graphicData>
+            </a:graphic>
+          </wp:inline>
+        </w:drawing>
+      </w:r>
     </w:p>
     <w:p>
       <w:pPr>
@@ -4008,6 +4083,7 @@
         <w:rPr>
           <w:b/>
         </w:rPr>
+        <w:lastRenderedPageBreak/>
         <w:t>Stage 1 (first cut)</w:t>
       </w:r>
       <w:r>
@@ -4047,11 +4123,7 @@
         <w:t>Within-family AUC</w:t>
       </w:r>
       <w:r>
-        <w:t xml:space="preserve"> is the same AUC computed only among CVs from the job's own role family. A role family is a group of jobs sharing a primary role, such as Python developer, QA engineer or data scientist (60 families, derived from each document's keyword and title). We report it </w:t>
-      </w:r>
-      <w:r>
-        <w:lastRenderedPageBreak/>
-        <w:t>because 8 of the 10 CVs per job share the job's family by design, so a system that only matches roles can score well overall. The within-family figure shows whether a system can still separate good from poor candidates inside the right role.</w:t>
+        <w:t xml:space="preserve"> is the same AUC computed only among CVs from the job's own role family. A role family is a group of jobs sharing a primary role, such as Python developer, QA engineer or data scientist (60 families, derived from each document's keyword and title). We report it because 8 of the 10 CVs per job share the job's family by design, so a system that only matches roles can score well overall. The within-family figure shows whether a system can still separate good from poor candidates inside the right role.</w:t>
       </w:r>
     </w:p>
     <w:p>
@@ -4556,6 +4628,7 @@
           </w:tcPr>
           <w:p>
             <w:r>
+              <w:lastRenderedPageBreak/>
               <w:t>X1 and skill overlap (X3)</w:t>
             </w:r>
           </w:p>
@@ -4822,11 +4895,7 @@
         </w:numPr>
       </w:pPr>
       <w:r>
-        <w:t xml:space="preserve">Extraction replaces the metadata on AUC: X2 ties the metadata reference (difference +0.005, confidence interval spanning zero). It does not replace it on retrieval, where Recall@50 is 0.779 </w:t>
-      </w:r>
-      <w:r>
-        <w:lastRenderedPageBreak/>
-        <w:t>against 0.929, because in a 500-CV pool an exact keyword acts as a hard filter and the soft role probability does not.</w:t>
+        <w:t>Extraction replaces the metadata on AUC: X2 ties the metadata reference (difference +0.005, confidence interval spanning zero). It does not replace it on retrieval, where Recall@50 is 0.779 against 0.929, because in a 500-CV pool an exact keyword acts as a hard filter and the soft role probability does not.</w:t>
       </w:r>
     </w:p>
     <w:p>
@@ -5118,7 +5187,11 @@
         <w:t>L1 improves what reaches the top 10.</w:t>
       </w:r>
       <w:r>
-        <w:t xml:space="preserve"> On job descriptions it never saw, L1 beats the X2 order by +0.065 [0.036, 0.096] in Recall@10 and beats a classifier trained without LLM scores by +0.031 [0.007, 0.056]. Against human grades the gain over X2 is smaller: per-JD AUC +0.068 [0.002, 0.143], with the interval barely above zero.</w:t>
+        <w:t xml:space="preserve"> On job descriptions it never saw, L1 beats the X2 order by +0.065 [0.036, 0.096] in Recall@10 and beats a classifier trained without LLM scores by +0.031 </w:t>
+      </w:r>
+      <w:r>
+        <w:lastRenderedPageBreak/>
+        <w:t>[0.007, 0.056]. Against human grades the gain over X2 is smaller: per-JD AUC +0.068 [0.002, 0.143], with the interval barely above zero.</w:t>
       </w:r>
     </w:p>
     <w:p>
@@ -5247,7 +5320,6 @@
           </w:tcPr>
           <w:p>
             <w:r>
-              <w:lastRenderedPageBreak/>
               <w:t>Learned first-cut classifier</w:t>
             </w:r>
           </w:p>
@@ -5652,6 +5724,7 @@
           </w:tcPr>
           <w:p>
             <w:r>
+              <w:lastRenderedPageBreak/>
               <w:t>Ranker L1 vs X2 on unseen jobs</w:t>
             </w:r>
           </w:p>
@@ -5824,7 +5897,6 @@
         <w:pStyle w:val="Heading2"/>
       </w:pPr>
       <w:r>
-        <w:lastRenderedPageBreak/>
         <w:t>6.3 Extraction and Conversational Evaluation</w:t>
       </w:r>
     </w:p>
@@ -6127,7 +6199,11 @@
     </w:p>
     <w:p>
       <w:r>
-        <w:t xml:space="preserve">The first chat version was checked on invented job and CV text. It returned the expected spans, declined to answer when support was missing, kept qualifiers such as negations, and reused the entity extraction. It can still decline when a useful excerpt exists, and source validation stops fabricated quotations without guaranteeing that the best passage was found. Unit tests and browser walkthroughs show controlled workflow </w:t>
+        <w:t xml:space="preserve">The first chat version was checked on invented job and CV text. It returned the expected spans, declined to answer when support was missing, kept qualifiers such as negations, and reused the entity extraction. </w:t>
+      </w:r>
+      <w:r>
+        <w:lastRenderedPageBreak/>
+        <w:t xml:space="preserve">It can still decline when a useful excerpt exists, and source validation stops fabricated quotations without guaranteeing that the best passage was found. Unit tests and browser walkthroughs show controlled workflow </w:t>
       </w:r>
       <w:proofErr w:type="spellStart"/>
       <w:r>
@@ -6267,18 +6343,247 @@
           </w:tcPr>
           <w:p>
             <w:r>
+              <w:t>Same judge for training and testing</w:t>
+            </w:r>
+          </w:p>
+        </w:tc>
+        <w:tc>
+          <w:tcPr>
+            <w:tcW w:w="4253" w:type="dxa"/>
+          </w:tcPr>
+          <w:p>
+            <w:r>
+              <w:t>The LLM that scored the training data also scores the stage-2 test reference</w:t>
+            </w:r>
+          </w:p>
+        </w:tc>
+        <w:tc>
+          <w:tcPr>
+            <w:tcW w:w="3367" w:type="dxa"/>
+          </w:tcPr>
+          <w:p>
+            <w:r>
+              <w:t>L1 may partly learn the judge's taste; the human check is positive but weak. C2 is zero-shot, so it was never trained on these scores</w:t>
+            </w:r>
+          </w:p>
+        </w:tc>
+      </w:tr>
+      <w:tr>
+        <w:tc>
+          <w:tcPr>
+            <w:tcW w:w="1740" w:type="dxa"/>
+          </w:tcPr>
+          <w:p>
+            <w:proofErr w:type="spellStart"/>
+            <w:r>
+              <w:t>Generalisation</w:t>
+            </w:r>
+            <w:proofErr w:type="spellEnd"/>
+          </w:p>
+        </w:tc>
+        <w:tc>
+          <w:tcPr>
+            <w:tcW w:w="4253" w:type="dxa"/>
+          </w:tcPr>
+          <w:p>
+            <w:r>
+              <w:t>One regional IT job market, compact profiles, a fixed 600-CV pool and constructed 500-CV pools with unjudged distractors</w:t>
+            </w:r>
+          </w:p>
+        </w:tc>
+        <w:tc>
+          <w:tcPr>
+            <w:tcW w:w="3367" w:type="dxa"/>
+          </w:tcPr>
+          <w:p>
+            <w:r>
+              <w:t>Results do not establish performance on other professions, markets or full-length resumes; Recall is an upper bound</w:t>
+            </w:r>
+          </w:p>
+        </w:tc>
+      </w:tr>
+      <w:tr>
+        <w:tc>
+          <w:tcPr>
+            <w:tcW w:w="1740" w:type="dxa"/>
+          </w:tcPr>
+          <w:p>
+            <w:r>
+              <w:t>Role extraction on targeted jobs</w:t>
+            </w:r>
+          </w:p>
+        </w:tc>
+        <w:tc>
+          <w:tcPr>
+            <w:tcW w:w="4253" w:type="dxa"/>
+          </w:tcPr>
+          <w:p>
+            <w:r>
+              <w:t>Role accuracy for targeted job descriptions is 0.50</w:t>
+            </w:r>
+          </w:p>
+        </w:tc>
+        <w:tc>
+          <w:tcPr>
+            <w:tcW w:w="3367" w:type="dxa"/>
+          </w:tcPr>
+          <w:p>
+            <w:r>
+              <w:t>Every role-heavy variant loses on the targeted stratum</w:t>
+            </w:r>
+          </w:p>
+        </w:tc>
+      </w:tr>
+      <w:tr>
+        <w:tc>
+          <w:tcPr>
+            <w:tcW w:w="1740" w:type="dxa"/>
+          </w:tcPr>
+          <w:p>
+            <w:r>
+              <w:t>Post hoc decisions</w:t>
+            </w:r>
+          </w:p>
+        </w:tc>
+        <w:tc>
+          <w:tcPr>
+            <w:tcW w:w="4253" w:type="dxa"/>
+          </w:tcPr>
+          <w:p>
+            <w:r>
+              <w:t>Adopting C2 and collapsing to a single ranking stage were decided after seeing test results</w:t>
+            </w:r>
+          </w:p>
+        </w:tc>
+        <w:tc>
+          <w:tcPr>
+            <w:tcW w:w="3367" w:type="dxa"/>
+          </w:tcPr>
+          <w:p>
+            <w:r>
+              <w:t>Both are reported with the registered bar and the miss</w:t>
+            </w:r>
+          </w:p>
+        </w:tc>
+      </w:tr>
+      <w:tr>
+        <w:tc>
+          <w:tcPr>
+            <w:tcW w:w="1740" w:type="dxa"/>
+          </w:tcPr>
+          <w:p>
+            <w:r>
+              <w:t>Extraction validity</w:t>
+            </w:r>
+          </w:p>
+        </w:tc>
+        <w:tc>
+          <w:tcPr>
+            <w:tcW w:w="4253" w:type="dxa"/>
+          </w:tcPr>
+          <w:p>
+            <w:r>
+              <w:t>No held-out human entity gold for resumes; no test on application-authored job descriptions</w:t>
+            </w:r>
+          </w:p>
+        </w:tc>
+        <w:tc>
+          <w:tcPr>
+            <w:tcW w:w="3367" w:type="dxa"/>
+          </w:tcPr>
+          <w:p>
+            <w:r>
+              <w:t>Extraction accuracy on real resumes is not established</w:t>
+            </w:r>
+          </w:p>
+        </w:tc>
+      </w:tr>
+      <w:tr>
+        <w:tc>
+          <w:tcPr>
+            <w:tcW w:w="1740" w:type="dxa"/>
+          </w:tcPr>
+          <w:p>
+            <w:r>
+              <w:t>Human outcomes</w:t>
+            </w:r>
+          </w:p>
+        </w:tc>
+        <w:tc>
+          <w:tcPr>
+            <w:tcW w:w="4253" w:type="dxa"/>
+          </w:tcPr>
+          <w:p>
+            <w:r>
+              <w:t>No recruiter study; speed is system time only</w:t>
+            </w:r>
+          </w:p>
+        </w:tc>
+        <w:tc>
+          <w:tcPr>
+            <w:tcW w:w="3367" w:type="dxa"/>
+          </w:tcPr>
+          <w:p>
+            <w:r>
+              <w:t>Time saved and usefulness are untested</w:t>
+            </w:r>
+          </w:p>
+        </w:tc>
+      </w:tr>
+      <w:tr>
+        <w:tc>
+          <w:tcPr>
+            <w:tcW w:w="1740" w:type="dxa"/>
+          </w:tcPr>
+          <w:p>
+            <w:r>
+              <w:t>Fairness</w:t>
+            </w:r>
+          </w:p>
+        </w:tc>
+        <w:tc>
+          <w:tcPr>
+            <w:tcW w:w="4253" w:type="dxa"/>
+          </w:tcPr>
+          <w:p>
+            <w:r>
+              <w:t>Slices by role family or experience are not a demographic fairness evaluation</w:t>
+            </w:r>
+          </w:p>
+        </w:tc>
+        <w:tc>
+          <w:tcPr>
+            <w:tcW w:w="3367" w:type="dxa"/>
+          </w:tcPr>
+          <w:p>
+            <w:r>
+              <w:t>No fairness conclusion follows</w:t>
+            </w:r>
+          </w:p>
+        </w:tc>
+      </w:tr>
+      <w:tr>
+        <w:tc>
+          <w:tcPr>
+            <w:tcW w:w="1740" w:type="dxa"/>
+          </w:tcPr>
+          <w:p>
+            <w:r>
+              <w:t>Residual metadata leak</w:t>
+            </w:r>
+          </w:p>
+        </w:tc>
+        <w:tc>
+          <w:tcPr>
+            <w:tcW w:w="4253" w:type="dxa"/>
+          </w:tcPr>
+          <w:p>
+            <w:r>
+              <w:t xml:space="preserve">Removing the CV title field does not remove it from the text: the old title still appears in </w:t>
+            </w:r>
+            <w:r>
               <w:lastRenderedPageBreak/>
-              <w:t>Same judge for training and testing</w:t>
-            </w:r>
-          </w:p>
-        </w:tc>
-        <w:tc>
-          <w:tcPr>
-            <w:tcW w:w="4253" w:type="dxa"/>
-          </w:tcPr>
-          <w:p>
-            <w:r>
-              <w:t>The LLM that scored the training data also scores the stage-2 test reference</w:t>
+              <w:t>22.7% [19.3, 26.0] of the 600 benchmark CVs (20.3% generic, 27.5% targeted)</w:t>
             </w:r>
           </w:p>
         </w:tc>
@@ -6288,233 +6593,12 @@
           </w:tcPr>
           <w:p>
             <w:r>
-              <w:t>L1 may partly learn the judge's taste; the human check is positive but weak. C2 is zero-shot, so it was never trained on these scores</w:t>
-            </w:r>
-          </w:p>
-        </w:tc>
-      </w:tr>
-      <w:tr>
-        <w:tc>
-          <w:tcPr>
-            <w:tcW w:w="1740" w:type="dxa"/>
-          </w:tcPr>
-          <w:p>
-            <w:proofErr w:type="spellStart"/>
-            <w:r>
-              <w:t>Generalisation</w:t>
-            </w:r>
-            <w:proofErr w:type="spellEnd"/>
-          </w:p>
-        </w:tc>
-        <w:tc>
-          <w:tcPr>
-            <w:tcW w:w="4253" w:type="dxa"/>
-          </w:tcPr>
-          <w:p>
-            <w:r>
-              <w:t>One regional IT job market, compact profiles, a fixed 600-CV pool and constructed 500-CV pools with unjudged distractors</w:t>
-            </w:r>
-          </w:p>
-        </w:tc>
-        <w:tc>
-          <w:tcPr>
-            <w:tcW w:w="3367" w:type="dxa"/>
-          </w:tcPr>
-          <w:p>
-            <w:r>
-              <w:t>Results do not establish performance on other professions, markets or full-length resumes; Recall is an upper bound</w:t>
-            </w:r>
-          </w:p>
-        </w:tc>
-      </w:tr>
-      <w:tr>
-        <w:tc>
-          <w:tcPr>
-            <w:tcW w:w="1740" w:type="dxa"/>
-          </w:tcPr>
-          <w:p>
-            <w:r>
-              <w:t>Role extraction on targeted jobs</w:t>
-            </w:r>
-          </w:p>
-        </w:tc>
-        <w:tc>
-          <w:tcPr>
-            <w:tcW w:w="4253" w:type="dxa"/>
-          </w:tcPr>
-          <w:p>
-            <w:r>
-              <w:t>Role accuracy for targeted job descriptions is 0.50</w:t>
-            </w:r>
-          </w:p>
-        </w:tc>
-        <w:tc>
-          <w:tcPr>
-            <w:tcW w:w="3367" w:type="dxa"/>
-          </w:tcPr>
-          <w:p>
-            <w:r>
-              <w:t>Every role-heavy variant loses on the targeted stratum</w:t>
-            </w:r>
-          </w:p>
-        </w:tc>
-      </w:tr>
-      <w:tr>
-        <w:tc>
-          <w:tcPr>
-            <w:tcW w:w="1740" w:type="dxa"/>
-          </w:tcPr>
-          <w:p>
-            <w:r>
-              <w:t>Post hoc decisions</w:t>
-            </w:r>
-          </w:p>
-        </w:tc>
-        <w:tc>
-          <w:tcPr>
-            <w:tcW w:w="4253" w:type="dxa"/>
-          </w:tcPr>
-          <w:p>
-            <w:r>
-              <w:t>Adopting C2 and collapsing to a single ranking stage were decided after seeing test results</w:t>
-            </w:r>
-          </w:p>
-        </w:tc>
-        <w:tc>
-          <w:tcPr>
-            <w:tcW w:w="3367" w:type="dxa"/>
-          </w:tcPr>
-          <w:p>
-            <w:r>
-              <w:t>Both are reported with the registered bar and the miss</w:t>
-            </w:r>
-          </w:p>
-        </w:tc>
-      </w:tr>
-      <w:tr>
-        <w:tc>
-          <w:tcPr>
-            <w:tcW w:w="1740" w:type="dxa"/>
-          </w:tcPr>
-          <w:p>
-            <w:r>
-              <w:t>Extraction validity</w:t>
-            </w:r>
-          </w:p>
-        </w:tc>
-        <w:tc>
-          <w:tcPr>
-            <w:tcW w:w="4253" w:type="dxa"/>
-          </w:tcPr>
-          <w:p>
-            <w:r>
-              <w:t>No held-out human entity gold for resumes; no test on application-authored job descriptions</w:t>
-            </w:r>
-          </w:p>
-        </w:tc>
-        <w:tc>
-          <w:tcPr>
-            <w:tcW w:w="3367" w:type="dxa"/>
-          </w:tcPr>
-          <w:p>
-            <w:r>
-              <w:t>Extraction accuracy on real resumes is not established</w:t>
-            </w:r>
-          </w:p>
-        </w:tc>
-      </w:tr>
-      <w:tr>
-        <w:tc>
-          <w:tcPr>
-            <w:tcW w:w="1740" w:type="dxa"/>
-          </w:tcPr>
-          <w:p>
-            <w:r>
-              <w:t>Human outcomes</w:t>
-            </w:r>
-          </w:p>
-        </w:tc>
-        <w:tc>
-          <w:tcPr>
-            <w:tcW w:w="4253" w:type="dxa"/>
-          </w:tcPr>
-          <w:p>
-            <w:r>
-              <w:t>No recruiter study; speed is system time only</w:t>
-            </w:r>
-          </w:p>
-        </w:tc>
-        <w:tc>
-          <w:tcPr>
-            <w:tcW w:w="3367" w:type="dxa"/>
-          </w:tcPr>
-          <w:p>
-            <w:r>
-              <w:t>Time saved and usefulness are untested</w:t>
-            </w:r>
-          </w:p>
-        </w:tc>
-      </w:tr>
-      <w:tr>
-        <w:tc>
-          <w:tcPr>
-            <w:tcW w:w="1740" w:type="dxa"/>
-          </w:tcPr>
-          <w:p>
-            <w:r>
-              <w:t>Fairness</w:t>
-            </w:r>
-          </w:p>
-        </w:tc>
-        <w:tc>
-          <w:tcPr>
-            <w:tcW w:w="4253" w:type="dxa"/>
-          </w:tcPr>
-          <w:p>
-            <w:r>
-              <w:t>Slices by role family or experience are not a demographic fairness evaluation</w:t>
-            </w:r>
-          </w:p>
-        </w:tc>
-        <w:tc>
-          <w:tcPr>
-            <w:tcW w:w="3367" w:type="dxa"/>
-          </w:tcPr>
-          <w:p>
-            <w:r>
-              <w:t>No fairness conclusion follows</w:t>
-            </w:r>
-          </w:p>
-        </w:tc>
-      </w:tr>
-      <w:tr>
-        <w:tc>
-          <w:tcPr>
-            <w:tcW w:w="1740" w:type="dxa"/>
-          </w:tcPr>
-          <w:p>
-            <w:r>
-              <w:t>Residual metadata leak</w:t>
-            </w:r>
-          </w:p>
-        </w:tc>
-        <w:tc>
-          <w:tcPr>
-            <w:tcW w:w="4253" w:type="dxa"/>
-          </w:tcPr>
-          <w:p>
-            <w:r>
-              <w:t>Removing the CV title field does not remove it from the text: the old title still appears in 22.7% [19.3, 26.0] of the 600 benchmark CVs (20.3% generic, 27.5% targeted)</w:t>
-            </w:r>
-          </w:p>
-        </w:tc>
-        <w:tc>
-          <w:tcPr>
-            <w:tcW w:w="3367" w:type="dxa"/>
-          </w:tcPr>
-          <w:p>
-            <w:r>
-              <w:t>Role extraction may be slightly easier on the benchmark than on CVs without a visible title; the figure is reported beside every text-only result</w:t>
+              <w:lastRenderedPageBreak/>
+              <w:t xml:space="preserve">Role extraction may be slightly easier on the benchmark than on CVs without a visible title; the </w:t>
+            </w:r>
+            <w:r>
+              <w:lastRenderedPageBreak/>
+              <w:t>figure is reported beside every text-only result</w:t>
             </w:r>
           </w:p>
         </w:tc>
@@ -6525,6 +6609,7 @@
         <w:pStyle w:val="Heading2"/>
       </w:pPr>
       <w:r>
+        <w:lastRenderedPageBreak/>
         <w:t>6.5 Conclusions</w:t>
       </w:r>
     </w:p>
@@ -6566,11 +6651,7 @@
         <w:t>Learning to rank the shortlist is what improves the top 10.</w:t>
       </w:r>
       <w:r>
-        <w:t xml:space="preserve"> L1, trained on LLM scores, raised Recall@10 from 0.417 to 0.475, meaning more of the right candidates reach the top 10, and </w:t>
-      </w:r>
-      <w:r>
-        <w:lastRenderedPageBreak/>
-        <w:t>nDCG@10 from 0.775 to 0.820. L1 is cheap enough to rank the whole pool in one stage and gives the same top ten as the two-stage arrangement for 59 of 60 jobs, so the delivered system uses it as the first stage.</w:t>
+        <w:t xml:space="preserve"> L1, trained on LLM scores, raised Recall@10 from 0.417 to 0.475, meaning more of the right candidates reach the top 10, and nDCG@10 from 0.775 to 0.820. L1 is cheap enough to rank the whole pool in one stage and gives the same top ten as the two-stage arrangement for 59 of 60 jobs, so the delivered system uses it as the first stage.</w:t>
       </w:r>
     </w:p>
     <w:p>
@@ -6649,14 +6730,6 @@
         <w:pStyle w:val="Heading1"/>
       </w:pPr>
       <w:r>
-        <w:t>7. Chatbot</w:t>
-      </w:r>
-    </w:p>
-    <w:p>
-      <w:pPr>
-        <w:pStyle w:val="Heading1"/>
-      </w:pPr>
-      <w:r>
         <w:t>8. Deployment</w:t>
       </w:r>
     </w:p>
@@ -6716,6 +6789,7 @@
         </w:numPr>
       </w:pPr>
       <w:r>
+        <w:lastRenderedPageBreak/>
         <w:t>Nothing is fitted at run time. L1 is stored as a small JSON file, and the TF-IDF vocabulary and concept statistics are saved as hash-checked files without pickling.</w:t>
       </w:r>
     </w:p>
@@ -6796,7 +6870,6 @@
         </w:numPr>
       </w:pPr>
       <w:r>
-        <w:lastRenderedPageBreak/>
         <w:t>The 60 benchmark jobs continue to read the saved CSV rankings, independently of the live model.</w:t>
       </w:r>
     </w:p>
@@ -7081,6 +7154,7 @@
         </w:numPr>
       </w:pPr>
       <w:r>
+        <w:lastRenderedPageBreak/>
         <w:t>Apple Silicon and Docker Desktop runs are still pending.</w:t>
       </w:r>
     </w:p>
@@ -7110,7 +7184,6 @@
         <w:pStyle w:val="Heading2"/>
       </w:pPr>
       <w:r>
-        <w:lastRenderedPageBreak/>
         <w:t>9.2 Future Work</w:t>
       </w:r>
     </w:p>
@@ -7476,6 +7549,7 @@
           </w:tcPr>
           <w:p>
             <w:r>
+              <w:lastRenderedPageBreak/>
               <w:t>Hugging Face Hub</w:t>
             </w:r>
           </w:p>
@@ -7692,7 +7766,6 @@
           <w:p>
             <w:proofErr w:type="spellStart"/>
             <w:r>
-              <w:lastRenderedPageBreak/>
               <w:t>GLiNER</w:t>
             </w:r>
             <w:proofErr w:type="spellEnd"/>
@@ -8090,6 +8163,7 @@
         <w:pStyle w:val="Heading1"/>
       </w:pPr>
       <w:r>
+        <w:lastRenderedPageBreak/>
         <w:t>11. Individual Contributions</w:t>
       </w:r>
     </w:p>
@@ -8233,7 +8307,6 @@
           </w:tcPr>
           <w:p>
             <w:r>
-              <w:lastRenderedPageBreak/>
               <w:t>Role-family classifier</w:t>
             </w:r>
           </w:p>
@@ -8570,6 +8643,7 @@
         </w:numPr>
       </w:pPr>
       <w:r>
+        <w:lastRenderedPageBreak/>
         <w:t>Chapter 7 (chatbot and user flow) and the chat parts of 5.3, 3.2 and 6.3 are for the chat's authors to complete and review.</w:t>
       </w:r>
     </w:p>
@@ -8630,7 +8704,6 @@
         <w:pStyle w:val="Heading2"/>
       </w:pPr>
       <w:r>
-        <w:lastRenderedPageBreak/>
         <w:t>Source and Status Register</w:t>
       </w:r>
     </w:p>
@@ -8955,6 +9028,7 @@
     </w:tbl>
     <w:p>
       <w:r>
+        <w:lastRenderedPageBreak/>
         <w:t>The report distinguishes committed implementation, observed local artifacts, concurrent uncommitted development and proposed work. It does not certify production readiness, independent recruitment accuracy or completion of outstanding reproduction checks.</w:t>
       </w:r>
     </w:p>
@@ -8984,11 +9058,7 @@
     </w:p>
     <w:p>
       <w:r>
-        <w:t xml:space="preserve">Recruitment teams receive large volumes of resumes in PDF and DOCX formats, but initial screening remains heavily manual. A recruiter may spend 20-30 minutes reviewing one application, making it </w:t>
-      </w:r>
-      <w:r>
-        <w:lastRenderedPageBreak/>
-        <w:t>difficult to process hundreds of candidates consistently. Important evidence such as transferable skills, technical tools and relevant experience may also be missed when wording differs between a resume and a job description. This project proposes an Intelligent Candidate Screening System that analyses resume and job-description text, ranks applicants against role requirements and explains each score through a conversational recruiter interface.</w:t>
+        <w:t>Recruitment teams receive large volumes of resumes in PDF and DOCX formats, but initial screening remains heavily manual. A recruiter may spend 20-30 minutes reviewing one application, making it difficult to process hundreds of candidates consistently. Important evidence such as transferable skills, technical tools and relevant experience may also be missed when wording differs between a resume and a job description. This project proposes an Intelligent Candidate Screening System that analyses resume and job-description text, ranks applicants against role requirements and explains each score through a conversational recruiter interface.</w:t>
       </w:r>
     </w:p>
     <w:p>
@@ -9108,6 +9178,7 @@
         <w:pStyle w:val="Heading2"/>
       </w:pPr>
       <w:r>
+        <w:lastRenderedPageBreak/>
         <w:t>4. Project Design</w:t>
       </w:r>
     </w:p>
@@ -9157,7 +9228,6 @@
         <w:rPr>
           <w:b/>
         </w:rPr>
-        <w:lastRenderedPageBreak/>
         <w:t>Baseline Models:</w:t>
       </w:r>
     </w:p>
@@ -9326,6 +9396,7 @@
         <w:pStyle w:val="Heading2"/>
       </w:pPr>
       <w:r>
+        <w:lastRenderedPageBreak/>
         <w:t>4.3 Development Methodology</w:t>
       </w:r>
     </w:p>
@@ -9406,7 +9477,6 @@
         <w:rPr>
           <w:b/>
         </w:rPr>
-        <w:lastRenderedPageBreak/>
         <w:t>Baseline Modelling</w:t>
       </w:r>
       <w:r>
@@ -9630,6 +9700,7 @@
       </w:pPr>
       <w:proofErr w:type="spellStart"/>
       <w:r>
+        <w:lastRenderedPageBreak/>
         <w:t>Normalise</w:t>
       </w:r>
       <w:proofErr w:type="spellEnd"/>
@@ -9798,7 +9869,6 @@
           <w:p>
             <w:proofErr w:type="spellStart"/>
             <w:r>
-              <w:lastRenderedPageBreak/>
               <w:t>GLiNER</w:t>
             </w:r>
             <w:proofErr w:type="spellEnd"/>
@@ -10185,6 +10255,7 @@
         </w:numPr>
       </w:pPr>
       <w:r>
+        <w:lastRenderedPageBreak/>
         <w:t xml:space="preserve">Fine-tuned BERT and </w:t>
       </w:r>
       <w:proofErr w:type="spellStart"/>
@@ -10261,7 +10332,6 @@
         <w:pStyle w:val="Heading2"/>
       </w:pPr>
       <w:r>
-        <w:lastRenderedPageBreak/>
         <w:t>7. Success Measures</w:t>
       </w:r>
     </w:p>
@@ -10793,6 +10863,7 @@
         <w:pStyle w:val="Heading2"/>
       </w:pPr>
       <w:r>
+        <w:lastRenderedPageBreak/>
         <w:t>9. Expected Value and ROI Assumptions</w:t>
       </w:r>
     </w:p>
@@ -10874,7 +10945,6 @@
         <w:pStyle w:val="Heading2"/>
       </w:pPr>
       <w:r>
-        <w:lastRenderedPageBreak/>
         <w:t>10. Risks and Mitigations</w:t>
       </w:r>
     </w:p>

</xml_diff>